<commit_message>
Update Word CV to current version
Co-Authored-By: Claude Opus 5.5 <noreply@anthropic.com>
Claude-Session: https://claude.ai/code/session_01DdZJJUHagQEPmtcFADPQXa
</commit_message>
<xml_diff>
--- a/Rahiem_Brooks_CV.docx
+++ b/Rahiem_Brooks_CV.docx
@@ -922,7 +922,7 @@
           <w:color w:val="555555"/>
           <w:sz w:val="19"/>
         </w:rPr>
-        <w:t>UNC School of Education · PI: Dr. Jessica Rodrigues · NIH-funded project</w:t>
+        <w:t>UNC School of Education · PI: Dr. Jessica Rodrigues · NSF CAREER Award #2237053 (Project KEY)</w:t>
       </w:r>
     </w:p>
     <w:p>
@@ -1096,7 +1096,7 @@
           <w:rFonts w:ascii="Times New Roman" w:hAnsi="Times New Roman" w:cs="Times New Roman"/>
           <w:sz w:val="20"/>
         </w:rPr>
-        <w:t>Independently designed a neuroscience-informed parenting intervention integrating parent education and a child learning interface for children ages 3–5.</w:t>
+        <w:t>Independently designed a neuroscience-informed parenting intervention integrating parent education and a child learning interface, delivered to caregivers of children ages 3–5.</w:t>
       </w:r>
     </w:p>
     <w:p>
@@ -1144,7 +1144,23 @@
           <w:rFonts w:ascii="Times New Roman" w:hAnsi="Times New Roman" w:cs="Times New Roman"/>
           <w:sz w:val="20"/>
         </w:rPr>
-        <w:t>Independently collected primary data across four phases: Caregiver Readiness and Interest Survey, Pre-Intervention Assessment, Post-Intervention Assessment, and App Usability Testing.</w:t>
+        <w:t>Independently collected primary data across four phases with caregivers of children birth to five: Caregiver Readiness and Interest Survey, Pre-Intervention Assessment, Post-Intervention Assessment, and App Usability Testing.</w:t>
+      </w:r>
+    </w:p>
+    <w:p>
+      <w:pPr>
+        <w:pStyle w:val="ListBullet"/>
+        <w:spacing w:after="20"/>
+        <w:rPr>
+          <w:rFonts w:ascii="Times New Roman" w:hAnsi="Times New Roman" w:cs="Times New Roman"/>
+        </w:rPr>
+      </w:pPr>
+      <w:r>
+        <w:rPr>
+          <w:rFonts w:ascii="Times New Roman" w:hAnsi="Times New Roman" w:cs="Times New Roman"/>
+          <w:sz w:val="20"/>
+        </w:rPr>
+        <w:t>Documented caregiving barriers and family stress across the full birth-to-five range from the Waves 1–2 caregiver sample; these findings set the design targets for the intervention.</w:t>
       </w:r>
     </w:p>
     <w:p>
@@ -1821,7 +1837,65 @@
           <w:rFonts w:ascii="Times New Roman" w:hAnsi="Times New Roman" w:cs="Times New Roman"/>
           <w:sz w:val="20"/>
         </w:rPr>
-        <w:t>Rodrigues, J., Singell, E. L., Dash, S., &amp; Brooks, R. J. (in preparation). Communicating research-informed mathematics recommendations to teachers: A systematic analysis of practitioner journal articles. Math Potentials Lab, UNC–Chapel Hill; NIH-funded (PI: Dr. Jessica Rodrigues). Pre-registered on the Open Science Framework (OSF Registries, July 10, 2026). Anticipated submission: August 2026. Contribution: authored the manuscript introduction and literature review.</w:t>
+        <w:t>Rodrigues, J., Singell, E. L., Dash, S., &amp; Brooks, R. J. (in preparation). Communicating research-informed mathematics recommendations to teachers: A systematic analysis of practitioner journal articles. Math Potentials Lab, UNC–Chapel Hill; NSF CAREER Award #2237053 (PI: Dr. Jessica Rodrigues). Pre-registered on the Open Science Framework (OSF Registries, July 10, 2026). Anticipated submission: August 2026. Contribution: authored the manuscript introduction and literature review.</w:t>
+      </w:r>
+    </w:p>
+    <w:p>
+      <w:pPr>
+        <w:pStyle w:val="ListBullet"/>
+        <w:spacing w:after="20"/>
+        <w:rPr>
+          <w:rFonts w:ascii="Times New Roman" w:hAnsi="Times New Roman" w:cs="Times New Roman"/>
+          <w:sz w:val="20"/>
+          <w:szCs w:val="20"/>
+        </w:rPr>
+      </w:pPr>
+      <w:r>
+        <w:rPr>
+          <w:rFonts w:ascii="Times New Roman" w:hAnsi="Times New Roman" w:cs="Times New Roman"/>
+          <w:color w:val="000000"/>
+          <w:sz w:val="20"/>
+          <w:szCs w:val="20"/>
+        </w:rPr>
+        <w:t xml:space="preserve">Brooks, R. J., &amp; Rodrigues, J. (2026). </w:t>
+      </w:r>
+      <w:r>
+        <w:rPr>
+          <w:rStyle w:val="Emphasis"/>
+          <w:rFonts w:ascii="Times New Roman" w:hAnsi="Times New Roman" w:cs="Times New Roman"/>
+          <w:color w:val="000000"/>
+          <w:sz w:val="20"/>
+          <w:szCs w:val="20"/>
+        </w:rPr>
+        <w:t xml:space="preserve">Two kids get the same answer. Only one understands fractions</w:t>
+      </w:r>
+      <w:r>
+        <w:rPr>
+          <w:rFonts w:ascii="Times New Roman" w:hAnsi="Times New Roman" w:cs="Times New Roman"/>
+          <w:color w:val="000000"/>
+          <w:sz w:val="20"/>
+          <w:szCs w:val="20"/>
+        </w:rPr>
+        <w:t xml:space="preserve"> [Manuscript completed; submission pending]. </w:t>
+      </w:r>
+      <w:r>
+        <w:rPr>
+          <w:rStyle w:val="Emphasis"/>
+          <w:rFonts w:ascii="Times New Roman" w:hAnsi="Times New Roman" w:cs="Times New Roman"/>
+          <w:color w:val="000000"/>
+          <w:sz w:val="20"/>
+          <w:szCs w:val="20"/>
+        </w:rPr>
+        <w:t xml:space="preserve">Frontiers for Young Minds</w:t>
+      </w:r>
+      <w:r>
+        <w:rPr>
+          <w:rFonts w:ascii="Times New Roman" w:hAnsi="Times New Roman" w:cs="Times New Roman"/>
+          <w:color w:val="000000"/>
+          <w:sz w:val="20"/>
+          <w:szCs w:val="20"/>
+        </w:rPr>
+        <w:t xml:space="preserve">. Core Concept article (Mathematics and Economics section) translating research on fraction magnitude, representational translation, and deep learning for readers ages 8–11; argues that answer-only assessment cannot distinguish a memorized procedure from conceptual understanding. Contribution: first author; conceptualization, writing, and figure design.</w:t>
       </w:r>
     </w:p>
     <w:p>
@@ -1905,6 +1979,22 @@
           <w:sz w:val="20"/>
         </w:rPr>
         <w:t>Brooks, R. J. (2026). The PANDA Study. Annual Meeting of the Society for Neuroscience (SfN).</w:t>
+      </w:r>
+    </w:p>
+    <w:p>
+      <w:pPr>
+        <w:pStyle w:val="ListBullet"/>
+        <w:spacing w:after="20"/>
+        <w:rPr>
+          <w:rFonts w:ascii="Times New Roman" w:hAnsi="Times New Roman" w:cs="Times New Roman"/>
+        </w:rPr>
+      </w:pPr>
+      <w:r>
+        <w:rPr>
+          <w:rFonts w:ascii="Times New Roman" w:hAnsi="Times New Roman" w:cs="Times New Roman"/>
+          <w:sz w:val="20"/>
+        </w:rPr>
+        <w:t xml:space="preserve">Rodrigues, J., Gustaveson, A., Duncanson, E., Yu, B., Mukashyaka, A., Schulze, S., Brooks, R. J., Dos Santos Araujo Lourenco, A., Scotti D’abbusco, M., &amp; Aghoram, A. (2026, September). Unlocking math success: Disseminating research-backed recommendations to support students experiencing math difficulty. Poster presented at the North Carolina Annual Inclusion Summit, Appalachian State University, Boone, NC.</w:t>
       </w:r>
     </w:p>
     <w:p>
@@ -2167,7 +2257,7 @@
           <w:sz w:val="20"/>
           <w:szCs w:val="20"/>
         </w:rPr>
-        <w:t xml:space="preserve"> [Systematic review registration]. OSF Registries. Generalized Systematic Review Registration, Math Potentials Lab, UNC–Chapel Hill; NIH-funded (PI: Dr. Jessica Rodrigues).</w:t>
+        <w:t xml:space="preserve"> [Systematic review registration]. OSF Registries. Generalized Systematic Review Registration, Math Potentials Lab, UNC–Chapel Hill; NSF CAREER Award #2237053 (PI: Dr. Jessica Rodrigues).</w:t>
       </w:r>
     </w:p>
     <w:p>
@@ -2206,7 +2296,7 @@
           <w:sz w:val="20"/>
           <w:szCs w:val="20"/>
         </w:rPr>
-        <w:t xml:space="preserve"> [Preregistration]. OSF Registries. Math Potentials Lab, UNC–Chapel Hill; NIH-funded (PI: Dr. Jessica Rodrigues).</w:t>
+        <w:t xml:space="preserve"> [Preregistration]. OSF Registries. Math Potentials Lab, UNC–Chapel Hill; NSF CAREER Award #2237053 (PI: Dr. Jessica Rodrigues).</w:t>
       </w:r>
     </w:p>
     <w:p>

</xml_diff>